<commit_message>
WP Measure Matching Change.
</commit_message>
<xml_diff>
--- a/Methods/Measure_Idea_Introductions.docx
+++ b/Methods/Measure_Idea_Introductions.docx
@@ -43,25 +43,7 @@
           <w:sz w:val="30"/>
           <w:szCs w:val="30"/>
         </w:rPr>
-        <w:t xml:space="preserve">All Working Paper authorship figures </w:t>
-      </w:r>
-      <w:r>
-        <w:rPr>
-          <w:b w:val="false"/>
-          <w:bCs w:val="false"/>
-          <w:sz w:val="30"/>
-          <w:szCs w:val="30"/>
-        </w:rPr>
-        <w:t xml:space="preserve">and text contents </w:t>
-      </w:r>
-      <w:r>
-        <w:rPr>
-          <w:b w:val="false"/>
-          <w:bCs w:val="false"/>
-          <w:sz w:val="30"/>
-          <w:szCs w:val="30"/>
-        </w:rPr>
-        <w:t>were collected using Antartctic Database Go (</w:t>
+        <w:t>All Working Paper authorship figures and text contents were collected using Antartctic Database Go (</w:t>
       </w:r>
       <w:hyperlink r:id="rId2">
         <w:r>
@@ -427,7 +409,70 @@
           <w:sz w:val="30"/>
           <w:szCs w:val="30"/>
         </w:rPr>
-        <w:t>For each country, there score was then equal to the sum of the contribution score of all nearest neighbour Working Papers they were a collaborator on, divided by the number of parties to that Working Paper.</w:t>
+        <w:t xml:space="preserve">For each country, </w:t>
+      </w:r>
+      <w:r>
+        <w:rPr>
+          <w:b w:val="false"/>
+          <w:bCs w:val="false"/>
+          <w:sz w:val="30"/>
+          <w:szCs w:val="30"/>
+        </w:rPr>
+        <w:t>their</w:t>
+      </w:r>
+      <w:r>
+        <w:rPr>
+          <w:b w:val="false"/>
+          <w:bCs w:val="false"/>
+          <w:sz w:val="30"/>
+          <w:szCs w:val="30"/>
+        </w:rPr>
+        <w:t xml:space="preserve"> score was then equal to the sum of the contribution score of all nearest neighbour Working Papers they were a collaborator on, divided by the number of </w:t>
+      </w:r>
+      <w:r>
+        <w:rPr>
+          <w:b w:val="false"/>
+          <w:bCs w:val="false"/>
+          <w:sz w:val="30"/>
+          <w:szCs w:val="30"/>
+        </w:rPr>
+        <w:t xml:space="preserve">countries </w:t>
+      </w:r>
+      <w:r>
+        <w:rPr>
+          <w:b w:val="false"/>
+          <w:bCs w:val="false"/>
+          <w:sz w:val="30"/>
+          <w:szCs w:val="30"/>
+        </w:rPr>
+        <w:t>part</w:t>
+      </w:r>
+      <w:r>
+        <w:rPr>
+          <w:b w:val="false"/>
+          <w:bCs w:val="false"/>
+          <w:sz w:val="30"/>
+          <w:szCs w:val="30"/>
+        </w:rPr>
+        <w:t>y</w:t>
+      </w:r>
+      <w:r>
+        <w:rPr>
+          <w:b w:val="false"/>
+          <w:bCs w:val="false"/>
+          <w:sz w:val="30"/>
+          <w:szCs w:val="30"/>
+        </w:rPr>
+        <w:t xml:space="preserve"> to that Working Paper. </w:t>
+      </w:r>
+      <w:r>
+        <w:rPr>
+          <w:b w:val="false"/>
+          <w:bCs w:val="false"/>
+          <w:sz w:val="30"/>
+          <w:szCs w:val="30"/>
+        </w:rPr>
+        <w:t>To filter down to countries, we dropped "ats", "scar", "comnap", "iaato", "asoc", and "ipy-ipo” from the list of each working papers parties.</w:t>
       </w:r>
     </w:p>
     <w:sectPr>

</xml_diff>